<commit_message>
fix(fsms): align ISO 22000 classification and audit duration
</commit_message>
<xml_diff>
--- a/backend/uaf_blank_set/13485/Initial Certification /Stage 1/FR.218_Application_Review_Form_R9&21.08.2026.docx
+++ b/backend/uaf_blank_set/13485/Initial Certification /Stage 1/FR.218_Application_Review_Form_R9&21.08.2026.docx
@@ -30167,57 +30167,15 @@
           </w:tcPr>
           <w:p>
             <w:pPr>
-              <w:pStyle w:val="TableParagraph"/>
-              <w:ind w:left="3839" w:right="3810"/>
-              <w:jc w:val="center"/>
-              <w:rPr>
-                <w:sz w:val="16"/>
-                <w:szCs w:val="16"/>
-                <w:lang w:val="en-US"/>
-              </w:rPr>
-            </w:pPr>
-            <w:r>
-              <w:rPr>
-                <w:sz w:val="16"/>
-                <w:szCs w:val="16"/>
-                <w:lang w:val="en-US"/>
-              </w:rPr>
-              <w:lastRenderedPageBreak/>
-              <w:t>ISO 22000</w:t>
-            </w:r>
-            <w:r>
-              <w:rPr>
-                <w:spacing w:val="-2"/>
-                <w:sz w:val="16"/>
-                <w:szCs w:val="16"/>
-                <w:lang w:val="en-US"/>
-              </w:rPr>
-              <w:t xml:space="preserve"> </w:t>
-            </w:r>
-            <w:r>
-              <w:rPr>
-                <w:sz w:val="16"/>
-                <w:szCs w:val="16"/>
-                <w:lang w:val="en-US"/>
-              </w:rPr>
-              <w:t>(T</w:t>
-            </w:r>
-            <w:r>
-              <w:rPr>
-                <w:sz w:val="20"/>
-                <w:szCs w:val="20"/>
-                <w:vertAlign w:val="subscript"/>
-                <w:lang w:val="en-US"/>
-              </w:rPr>
-              <w:t>s</w:t>
-            </w:r>
-            <w:r>
-              <w:rPr>
-                <w:sz w:val="16"/>
-                <w:szCs w:val="16"/>
-                <w:lang w:val="en-US"/>
-              </w:rPr>
-              <w:t>)</w:t>
+              <w:spacing w:before="0" w:after="0"/>
+            </w:pPr>
+            <w:r/>
+            <w:r>
+              <w:rPr>
+                <w:rFonts w:ascii="Times New Roman" w:hAnsi="Times New Roman"/>
+                <w:sz w:val="18"/>
+              </w:rPr>
+              <w:t>ISO 22000 (Ds)</w:t>
             </w:r>
           </w:p>
         </w:tc>
@@ -30233,47 +30191,15 @@
           </w:tcPr>
           <w:p>
             <w:pPr>
-              <w:pStyle w:val="TableParagraph"/>
-              <w:jc w:val="center"/>
-              <w:rPr>
-                <w:sz w:val="16"/>
-                <w:szCs w:val="16"/>
-                <w:lang w:val="en-US"/>
-              </w:rPr>
-            </w:pPr>
-            <w:r>
-              <w:rPr>
-                <w:b/>
-                <w:sz w:val="16"/>
-                <w:szCs w:val="16"/>
-                <w:lang w:val="en-US"/>
-              </w:rPr>
-              <w:t xml:space="preserve">Formula: </w:t>
-            </w:r>
-            <w:r>
-              <w:rPr>
-                <w:sz w:val="16"/>
-                <w:szCs w:val="16"/>
-                <w:lang w:val="en-US"/>
-              </w:rPr>
-              <w:t>T</w:t>
-            </w:r>
-            <w:r>
-              <w:rPr>
-                <w:sz w:val="20"/>
-                <w:szCs w:val="20"/>
-                <w:vertAlign w:val="subscript"/>
-                <w:lang w:val="en-US"/>
-              </w:rPr>
-              <w:t>s</w:t>
-            </w:r>
-            <w:r>
-              <w:rPr>
-                <w:sz w:val="16"/>
-                <w:szCs w:val="16"/>
-                <w:lang w:val="en-US"/>
-              </w:rPr>
-              <w:t xml:space="preserve"> = TD + TH + TMS + TFTE</w:t>
+              <w:spacing w:before="0" w:after="0"/>
+            </w:pPr>
+            <w:r/>
+            <w:r>
+              <w:rPr>
+                <w:rFonts w:ascii="Times New Roman" w:hAnsi="Times New Roman"/>
+                <w:sz w:val="18"/>
+              </w:rPr>
+              <w:t>Formula: Ds = TD + TH + TFTE</w:t>
             </w:r>
           </w:p>
         </w:tc>
@@ -30288,31 +30214,6 @@
           </w:tcPr>
           <w:p>
             <w:pPr>
-              <w:pStyle w:val="TableParagraph"/>
-              <w:ind w:left="31"/>
-              <w:rPr>
-                <w:sz w:val="16"/>
-                <w:szCs w:val="16"/>
-                <w:lang w:val="en-US"/>
-              </w:rPr>
-            </w:pPr>
-            <w:r>
-              <w:rPr>
-                <w:sz w:val="16"/>
-                <w:szCs w:val="16"/>
-                <w:lang w:val="en-US"/>
-              </w:rPr>
-              <w:t>Basic audit duration to be conducted in the field (on a day basis) TD</w:t>
-            </w:r>
-          </w:p>
-        </w:tc>
-        <w:tc>
-          <w:tcPr>
-            <w:tcW w:w="1501" w:type="dxa"/>
-            <w:vAlign w:val="center"/>
-          </w:tcPr>
-          <w:p>
-            <w:pPr>
               <w:spacing w:before="0" w:after="0"/>
             </w:pPr>
             <w:r/>
@@ -30321,7 +30222,26 @@
                 <w:rFonts w:ascii="Times New Roman" w:hAnsi="Times New Roman"/>
                 <w:sz w:val="18"/>
               </w:rPr>
-              <w:t>{{ man_day_result_fsms.base_ph1 if man_day_result_fsms else "" }}</w:t>
+              <w:t>Basic audit duration for the category/subcategory (TD)</w:t>
+            </w:r>
+          </w:p>
+        </w:tc>
+        <w:tc>
+          <w:tcPr>
+            <w:tcW w:w="1501" w:type="dxa"/>
+            <w:vAlign w:val="center"/>
+          </w:tcPr>
+          <w:p>
+            <w:pPr>
+              <w:spacing w:before="0" w:after="0"/>
+            </w:pPr>
+            <w:r/>
+            <w:r>
+              <w:rPr>
+                <w:rFonts w:ascii="Times New Roman" w:hAnsi="Times New Roman"/>
+                <w:sz w:val="18"/>
+              </w:rPr>
+              <w:t>{{ man_day_result_fsms.fsms_basic_duration if man_day_result_fsms else "" }}</w:t>
             </w:r>
           </w:p>
         </w:tc>
@@ -30379,31 +30299,6 @@
           </w:tcPr>
           <w:p>
             <w:pPr>
-              <w:pStyle w:val="TableParagraph"/>
-              <w:ind w:left="31"/>
-              <w:rPr>
-                <w:sz w:val="16"/>
-                <w:szCs w:val="16"/>
-                <w:lang w:val="en-US"/>
-              </w:rPr>
-            </w:pPr>
-            <w:r>
-              <w:rPr>
-                <w:sz w:val="16"/>
-                <w:szCs w:val="16"/>
-                <w:lang w:val="en-US"/>
-              </w:rPr>
-              <w:t>In the absence of the relevant management system, the number of days allocated for the audit; TMS</w:t>
-            </w:r>
-          </w:p>
-        </w:tc>
-        <w:tc>
-          <w:tcPr>
-            <w:tcW w:w="1501" w:type="dxa"/>
-            <w:vAlign w:val="center"/>
-          </w:tcPr>
-          <w:p>
-            <w:pPr>
               <w:spacing w:before="0" w:after="0"/>
             </w:pPr>
             <w:r/>
@@ -30412,37 +30307,13 @@
                 <w:rFonts w:ascii="Times New Roman" w:hAnsi="Times New Roman"/>
                 <w:sz w:val="18"/>
               </w:rPr>
-              <w:t>{{ man_day_result_fsms.base_init if man_day_result_fsms else "" }}</w:t>
-            </w:r>
-          </w:p>
-        </w:tc>
-        <w:tc>
-          <w:tcPr>
-            <w:tcW w:w="3134" w:type="dxa"/>
-          </w:tcPr>
-          <w:p>
-            <w:pPr>
-              <w:pStyle w:val="TableParagraph"/>
-              <w:ind w:left="31"/>
-              <w:rPr>
-                <w:sz w:val="16"/>
-                <w:szCs w:val="16"/>
-                <w:lang w:val="en-US"/>
-              </w:rPr>
-            </w:pPr>
-            <w:r>
-              <w:rPr>
-                <w:sz w:val="16"/>
-                <w:szCs w:val="16"/>
-                <w:lang w:val="en-US"/>
-              </w:rPr>
-              <w:t>Number of audit days determined according to the number of employees TFTE</w:t>
-            </w:r>
-          </w:p>
-        </w:tc>
-        <w:tc>
-          <w:tcPr>
-            <w:tcW w:w="1579" w:type="dxa"/>
+              <w:t>Effective food-safety FTE used</w:t>
+            </w:r>
+          </w:p>
+        </w:tc>
+        <w:tc>
+          <w:tcPr>
+            <w:tcW w:w="1501" w:type="dxa"/>
             <w:vAlign w:val="center"/>
           </w:tcPr>
           <w:p>
@@ -30456,6 +30327,43 @@
                 <w:sz w:val="18"/>
               </w:rPr>
               <w:t>{{ man_day_result_fsms.eps if man_day_result_fsms else "" }}</w:t>
+            </w:r>
+          </w:p>
+        </w:tc>
+        <w:tc>
+          <w:tcPr>
+            <w:tcW w:w="3134" w:type="dxa"/>
+          </w:tcPr>
+          <w:p>
+            <w:pPr>
+              <w:spacing w:before="0" w:after="0"/>
+            </w:pPr>
+            <w:r/>
+            <w:r>
+              <w:rPr>
+                <w:rFonts w:ascii="Times New Roman" w:hAnsi="Times New Roman"/>
+                <w:sz w:val="18"/>
+              </w:rPr>
+              <w:t>Audit-day contribution for FTE (TFTE)</w:t>
+            </w:r>
+          </w:p>
+        </w:tc>
+        <w:tc>
+          <w:tcPr>
+            <w:tcW w:w="1579" w:type="dxa"/>
+            <w:vAlign w:val="center"/>
+          </w:tcPr>
+          <w:p>
+            <w:pPr>
+              <w:spacing w:before="0" w:after="0"/>
+            </w:pPr>
+            <w:r/>
+            <w:r>
+              <w:rPr>
+                <w:rFonts w:ascii="Times New Roman" w:hAnsi="Times New Roman"/>
+                <w:sz w:val="18"/>
+              </w:rPr>
+              <w:t>{{ man_day_result_fsms.fsms_fte_addition if man_day_result_fsms else "" }}</w:t>
             </w:r>
           </w:p>
         </w:tc>
@@ -30470,31 +30378,6 @@
           </w:tcPr>
           <w:p>
             <w:pPr>
-              <w:pStyle w:val="TableParagraph"/>
-              <w:ind w:left="31"/>
-              <w:rPr>
-                <w:sz w:val="16"/>
-                <w:szCs w:val="16"/>
-                <w:lang w:val="en-US"/>
-              </w:rPr>
-            </w:pPr>
-            <w:r>
-              <w:rPr>
-                <w:sz w:val="16"/>
-                <w:szCs w:val="16"/>
-                <w:lang w:val="en-US"/>
-              </w:rPr>
-              <w:t>For each additional location visited</w:t>
-            </w:r>
-          </w:p>
-        </w:tc>
-        <w:tc>
-          <w:tcPr>
-            <w:tcW w:w="1501" w:type="dxa"/>
-            <w:vAlign w:val="center"/>
-          </w:tcPr>
-          <w:p>
-            <w:pPr>
               <w:spacing w:before="0" w:after="0"/>
             </w:pPr>
             <w:r/>
@@ -30503,54 +30386,13 @@
                 <w:rFonts w:ascii="Times New Roman" w:hAnsi="Times New Roman"/>
                 <w:sz w:val="18"/>
               </w:rPr>
-              <w:t>{{ man_day_result_fsms.site_addition if man_day_result_fsms else "" }}</w:t>
-            </w:r>
-          </w:p>
-        </w:tc>
-        <w:tc>
-          <w:tcPr>
-            <w:tcW w:w="3134" w:type="dxa"/>
-          </w:tcPr>
-          <w:p>
-            <w:pPr>
-              <w:pStyle w:val="TableParagraph"/>
-              <w:ind w:left="31"/>
-              <w:rPr>
-                <w:sz w:val="16"/>
-                <w:szCs w:val="16"/>
-                <w:lang w:val="en-US"/>
-              </w:rPr>
-            </w:pPr>
-            <w:r>
-              <w:rPr>
-                <w:sz w:val="16"/>
-                <w:szCs w:val="16"/>
-                <w:lang w:val="en-US"/>
-              </w:rPr>
-              <w:t>T</w:t>
-            </w:r>
-            <w:r>
-              <w:rPr>
-                <w:sz w:val="20"/>
-                <w:szCs w:val="20"/>
-                <w:vertAlign w:val="subscript"/>
-                <w:lang w:val="en-US"/>
-              </w:rPr>
-              <w:t>s</w:t>
-            </w:r>
-            <w:r>
-              <w:rPr>
-                <w:sz w:val="16"/>
-                <w:szCs w:val="16"/>
-                <w:lang w:val="en-US"/>
-              </w:rPr>
-              <w:t xml:space="preserve"> Value</w:t>
-            </w:r>
-          </w:p>
-        </w:tc>
-        <w:tc>
-          <w:tcPr>
-            <w:tcW w:w="1579" w:type="dxa"/>
+              <w:t>Additional audited-site duration</w:t>
+            </w:r>
+          </w:p>
+        </w:tc>
+        <w:tc>
+          <w:tcPr>
+            <w:tcW w:w="1501" w:type="dxa"/>
             <w:vAlign w:val="center"/>
           </w:tcPr>
           <w:p>
@@ -30563,7 +30405,44 @@
                 <w:rFonts w:ascii="Times New Roman" w:hAnsi="Times New Roman"/>
                 <w:sz w:val="18"/>
               </w:rPr>
-              <w:t>{{ man_day_result_fsms.ad if man_day_result_fsms else "" }}</w:t>
+              <w:t>{{ man_day_result_fsms.site_addition if man_day_result_fsms else "" }}</w:t>
+            </w:r>
+          </w:p>
+        </w:tc>
+        <w:tc>
+          <w:tcPr>
+            <w:tcW w:w="3134" w:type="dxa"/>
+          </w:tcPr>
+          <w:p>
+            <w:pPr>
+              <w:spacing w:before="0" w:after="0"/>
+            </w:pPr>
+            <w:r/>
+            <w:r>
+              <w:rPr>
+                <w:rFonts w:ascii="Times New Roman" w:hAnsi="Times New Roman"/>
+                <w:sz w:val="18"/>
+              </w:rPr>
+              <w:t>Ds value (Stage 1 + Stage 2)</w:t>
+            </w:r>
+          </w:p>
+        </w:tc>
+        <w:tc>
+          <w:tcPr>
+            <w:tcW w:w="1579" w:type="dxa"/>
+            <w:vAlign w:val="center"/>
+          </w:tcPr>
+          <w:p>
+            <w:pPr>
+              <w:spacing w:before="0" w:after="0"/>
+            </w:pPr>
+            <w:r/>
+            <w:r>
+              <w:rPr>
+                <w:rFonts w:ascii="Times New Roman" w:hAnsi="Times New Roman"/>
+                <w:sz w:val="18"/>
+              </w:rPr>
+              <w:t>{{ man_day_result_fsms.base_init if man_day_result_fsms else "" }}</w:t>
             </w:r>
           </w:p>
         </w:tc>

</xml_diff>